<commit_message>
docs: finalize closing letter
</commit_message>
<xml_diff>
--- a/docs/CARTA_ENCERRAMENTO_DOC_INTELLIGENCE.docx
+++ b/docs/CARTA_ENCERRAMENTO_DOC_INTELLIGENCE.docx
@@ -44,7 +44,7 @@
           <w:color w:val="697588"/>
           <w:sz w:val="18"/>
         </w:rPr>
-        <w:t>Escopo: Front-end com API, banco e IA simulados  |  Agosto de 2026</w:t>
+        <w:t>Escopo: Front-end com API, banco e IA simulados  |  Setembro de 2026</w:t>
       </w:r>
     </w:p>
     <w:p>
@@ -84,7 +84,7 @@
           <w:color w:val="1C2739"/>
           <w:sz w:val="22"/>
         </w:rPr>
-        <w:t>Ficaram de fora backend real, autenticação, autorização, storage de arquivos, integração com Supabase, processamento por IA multimodal e comunicação real com WhatsApp. Também não implementei fila distribuída, concorrência entre revisores, deduplicação por hash, paginação ou observabilidade de produção.</w:t>
+        <w:t>Ficaram de fora backend real, autenticação, autorização, armazenamento permanente de arquivos, IA multimodal e integração oficial com WhatsApp. Também não foram implementados fila distribuída, concorrência entre revisores, deduplicação por hash, observabilidade ou controles de produção para dados pessoais.</w:t>
       </w:r>
     </w:p>
     <w:p>
@@ -99,7 +99,7 @@
           <w:color w:val="1C2739"/>
           <w:sz w:val="22"/>
         </w:rPr>
-        <w:t>Esses itens foram deliberadamente adiados porque a entrega é da Trilha B e pede uma fatia vertical demonstrável, não o produto-alvo completo. Em vez de criar integrações superficiais, priorizei o fluxo que permite avaliar arquitetura e experiência: upload, status, resultado específico por tipo, baixa confiança, conferência, correção e aprovação. DocumentRepository e AIProcessor deixam pontos explícitos para substituir os mocks futuramente sem reescrever as páginas.</w:t>
+        <w:t>Esses itens foram adiados porque a Trilha B pede o projeto do sistema e uma fatia vertical demonstrável, não o produto completo. Priorizei o caminho de ponta a ponta: vincular arquivos a clientes, simular classificação e extração, separar baixa confiança, corrigir campos, aprovar ou recusar e consultar o histórico. DocumentRepository e AIProcessor preservam as fronteiras para substituir os mocks sem acoplar as páginas a uma tecnologia futura.</w:t>
       </w:r>
     </w:p>
     <w:p>
@@ -122,7 +122,7 @@
           <w:color w:val="1C2739"/>
           <w:sz w:val="22"/>
         </w:rPr>
-        <w:t>O primeiro limite seria a persistência em localStorage, seguida pelo processamento mantido no navegador. O armazenamento é pequeno, local a um único dispositivo e não oferece transações, controle de concorrência ou proteção adequada para dados sensíveis. Uma lista muito grande também exigiria paginação e busca no servidor.</w:t>
+        <w:t>O primeiro limite seria o localStorage, seguido pelo processamento no navegador. Ele não oferece capacidade, transações, compartilhamento, proteção de dados ou controle de concorrência. Com aproximadamente 1.500 documentos por dia - e picos ainda maiores - a listagem local, os previews temporários e a trilha editável não seriam confiáveis.</w:t>
       </w:r>
     </w:p>
     <w:p>
@@ -137,7 +137,7 @@
           <w:color w:val="1C2739"/>
           <w:sz w:val="22"/>
         </w:rPr>
-        <w:t>Em produção, os arquivos seriam enviados diretamente para storage privado, os metadados e eventos seriam persistidos por uma API e o processamento ocorreria em fila assíncrona. Workers independentes controlariam timeout, retentativa e limite de custo. A consulta usaria paginação e filtros no backend. Hash de conteúdo e chaves de idempotência substituiriam a comparação local usada nesta demonstração.</w:t>
+        <w:t>Em produção, arquivos iriam diretamente para storage privado; uma API autenticada persistiria metadados e eventos; e uma fila assíncrona distribuiria o processamento entre workers com timeout, retentativas, idempotência e limite de custo. Hash de conteúdo trataria duplicidade, enquanto paginação e versionamento otimista protegeriam consultas e correções simultâneas.</w:t>
       </w:r>
     </w:p>
     <w:p>
@@ -160,7 +160,7 @@
           <w:color w:val="1C2739"/>
           <w:sz w:val="22"/>
         </w:rPr>
-        <w:t>A decisão menos defensável fora do protótipo é usar localStorage como banco mockado e como origem da trilha de auditoria. Ela foi útil para demonstrar persistência após recarregar a página e permitiu manter todo o exercício no front-end. Entretanto, eventos locais podem ser alterados, arquivos não cabem de forma segura e dois funcionários não compartilham o mesmo estado.</w:t>
+        <w:t>A decisão menos defensável fora do protótipo é usar localStorage como banco e origem da trilha de auditoria. Ela acelerou a demonstração e permitiu recuperar o estado após recarregar a página, mas eventos locais podem ser alterados, os arquivos não persistem e dois funcionários não compartilham o mesmo estado.</w:t>
       </w:r>
     </w:p>
     <w:p>
@@ -175,7 +175,7 @@
           <w:color w:val="1C2739"/>
           <w:sz w:val="22"/>
         </w:rPr>
-        <w:t>Eu manteria a interface de repositório, mas substituiria a implementação por uma API autenticada antes de qualquer uso real. Os eventos passariam a ser imutáveis e associados à identidade do funcionário. O navegador receberia apenas os dados necessários para a tela e URLs assinadas de curta duração para visualizar arquivos.</w:t>
+        <w:t>Eu manteria a interface de repositório, mas substituiria sua implementação por uma API autenticada antes de qualquer uso real. Os eventos seriam imutáveis e ligados ao operador; o navegador receberia apenas os dados necessários e URLs assinadas de curta duração. Essa troca preservaria os casos de uso já demonstrados.</w:t>
       </w:r>
     </w:p>
     <w:p>
@@ -198,7 +198,7 @@
           <w:color w:val="1C2739"/>
           <w:sz w:val="22"/>
         </w:rPr>
-        <w:t>O trabalho foi desenvolvido incrementalmente em duas sessões entre 30 e 31 de agosto de 2026. Com base no histórico de commits e execuções, estimo aproximadamente cinco horas de trabalho ativo. Esse tempo inclui análise do enunciado, decisões de arquitetura, implementação das telas e serviços mockados, testes, correções e documentação. Como não foi utilizado cronômetro contínuo desde a primeira conversa, o valor é apresentado como estimativa, e não como medição exata.</w:t>
+        <w:t>O trabalho foi realizado incrementalmente em três sessões entre 30 de agosto e 1º de setembro de 2026. Estimo aproximadamente sete horas de trabalho ativo, incluindo análise, arquitetura, implementação, testes, correções, documentação, preparação da carta e validação do deploy. Como não houve cronômetro contínuo desde o início, o valor é uma estimativa baseada no histórico de commits e execuções.</w:t>
       </w:r>
     </w:p>
     <w:p>
@@ -221,7 +221,7 @@
           <w:color w:val="1C2739"/>
           <w:sz w:val="22"/>
         </w:rPr>
-        <w:t>O resultado não pretende simular produção. Ele demonstra uma arquitetura substituível e um fluxo interno coerente, mantendo visíveis os riscos que foram adiados. O foco foi entregar uma base pequena, testável e explicável, com decisões rastreáveis e espaço claro para evolução.</w:t>
+        <w:t>O resultado não pretende simular produção. Ele entrega uma base funcional, testável e explicável, registra os riscos adiados e demonstra como o fluxo pode evoluir para serviços seguros sem esconder as limitações do protótipo.</w:t>
       </w:r>
     </w:p>
     <w:sectPr>

</xml_diff>